<commit_message>
fix(peticoes): UF abreviado no endereçamento + ajustes textuais no RPV complementar
Mudanças aplicadas a todos os modelos:
- Endereçamento agora mostra apenas o UF do tribunal (TJGO -> GO, TJSP -> SP).
  Outros tribunais (TRF, STJ, STF) ficam como estão.

Ajustes no modelo rpv_complementar:
- "AO JUÍZO DE DIREITO DA" -> "AO JUÍZO DE DIREITO DO(A)"
- "Posteriormente, no [evento]" -> "Posteriormente, no evento n° [evento]"
- "homologados pela decisão de [ID]" -> "homologados pela decisão de evento n° [ID]"

Setup pendente:
  - Re-upload de rpv_complementar.docx no bucket peticoes-templates
  - Não precisa redeploy da função (só código frontend e template mudou)

Co-Authored-By: Claude Opus 4.7 (1M context) <noreply@anthropic.com>
</commit_message>
<xml_diff>
--- a/supabase/seeds/peticoes-templates/_modelo_original_rpv_complementar.docx
+++ b/supabase/seeds/peticoes-templates/_modelo_original_rpv_complementar.docx
@@ -24,7 +24,7 @@
           <w:szCs w:val="24"/>
           <w:rtl w:val="0"/>
         </w:rPr>
-        <w:t xml:space="preserve">AO JUÍZO DE DIREITO DA </w:t>
+        <w:t xml:space="preserve">AO JUÍZO DE DIREITO DO(A) </w:t>
       </w:r>
       <w:r>
         <w:fldChar w:fldCharType="begin"/>
@@ -354,7 +354,7 @@
           <w:rtl w:val="0"/>
         </w:rPr>
         <w:tab/>
-        <w:t xml:space="preserve">Posteriormente, no </w:t>
+        <w:t xml:space="preserve">Posteriormente, no evento n° </w:t>
       </w:r>
       <w:r>
         <w:fldChar w:fldCharType="begin"/>
@@ -406,7 +406,7 @@
           <w:szCs w:val="24"/>
           <w:rtl w:val="0"/>
         </w:rPr>
-        <w:t xml:space="preserve">, homologados pela decisão de </w:t>
+        <w:t xml:space="preserve">, homologados pela decisão de evento n° </w:t>
       </w:r>
       <w:r>
         <w:fldChar w:fldCharType="begin"/>

</xml_diff>